<commit_message>
Lab 1: fill in student name; Lab 3: put figures in order
</commit_message>
<xml_diff>
--- a/lab3/Lab3_AugustinCarazanu_FAF-243.docx
+++ b/lab3/Lab3_AugustinCarazanu_FAF-243.docx
@@ -926,90 +926,6 @@
     </w:p>
     <w:p>
       <w:pPr>
-        <w:spacing w:after="120"/>
-        <w:jc w:val="both"/>
-      </w:pPr>
-      <w:r>
-        <w:rPr>
-          <w:b/>
-          <w:sz w:val="24"/>
-        </w:rPr>
-        <w:t>Ctrl+R.</w:t>
-      </w:r>
-      <w:r>
-        <w:rPr>
-          <w:sz w:val="24"/>
-        </w:rPr>
-        <w:t xml:space="preserve"> After running </w:t>
-      </w:r>
-      <w:r>
-        <w:rPr>
-          <w:rFonts w:ascii="Courier New" w:hAnsi="Courier New"/>
-          <w:sz w:val="22"/>
-        </w:rPr>
-        <w:t>date</w:t>
-      </w:r>
-      <w:r>
-        <w:rPr>
-          <w:sz w:val="24"/>
-        </w:rPr>
-        <w:t xml:space="preserve">, </w:t>
-      </w:r>
-      <w:r>
-        <w:rPr>
-          <w:rFonts w:ascii="Courier New" w:hAnsi="Courier New"/>
-          <w:sz w:val="22"/>
-        </w:rPr>
-        <w:t>whoami</w:t>
-      </w:r>
-      <w:r>
-        <w:rPr>
-          <w:sz w:val="24"/>
-        </w:rPr>
-        <w:t xml:space="preserve"> and </w:t>
-      </w:r>
-      <w:r>
-        <w:rPr>
-          <w:rFonts w:ascii="Courier New" w:hAnsi="Courier New"/>
-          <w:sz w:val="22"/>
-        </w:rPr>
-        <w:t>pwd</w:t>
-      </w:r>
-      <w:r>
-        <w:rPr>
-          <w:sz w:val="24"/>
-        </w:rPr>
-        <w:t xml:space="preserve">, I pressed Ctrl+R and typed </w:t>
-      </w:r>
-      <w:r>
-        <w:rPr>
-          <w:rFonts w:ascii="Courier New" w:hAnsi="Courier New"/>
-          <w:sz w:val="22"/>
-        </w:rPr>
-        <w:t>dat</w:t>
-      </w:r>
-      <w:r>
-        <w:rPr>
-          <w:sz w:val="24"/>
-        </w:rPr>
-        <w:t xml:space="preserve">. The reverse history search found the earlier </w:t>
-      </w:r>
-      <w:r>
-        <w:rPr>
-          <w:rFonts w:ascii="Courier New" w:hAnsi="Courier New"/>
-          <w:sz w:val="22"/>
-        </w:rPr>
-        <w:t>date</w:t>
-      </w:r>
-      <w:r>
-        <w:rPr>
-          <w:sz w:val="24"/>
-        </w:rPr>
-        <w:t xml:space="preserve"> command, and Enter ran it again: the new time is 03:47:47, while the first run showed 03:47:14.</w:t>
-      </w:r>
-    </w:p>
-    <w:p>
-      <w:pPr>
         <w:keepNext/>
         <w:spacing w:before="120"/>
         <w:jc w:val="center"/>
@@ -1017,8 +933,254 @@
       <w:r>
         <w:drawing>
           <wp:inline xmlns:a="http://schemas.openxmlformats.org/drawingml/2006/main" xmlns:pic="http://schemas.openxmlformats.org/drawingml/2006/picture">
+            <wp:extent cx="5760000" cy="749524"/>
+            <wp:docPr id="4" name="Picture 4"/>
+            <wp:cNvGraphicFramePr>
+              <a:graphicFrameLocks noChangeAspect="1"/>
+            </wp:cNvGraphicFramePr>
+            <a:graphic>
+              <a:graphicData uri="http://schemas.openxmlformats.org/drawingml/2006/picture">
+                <pic:pic>
+                  <pic:nvPicPr>
+                    <pic:cNvPr id="0" name="1.2.png"/>
+                    <pic:cNvPicPr/>
+                  </pic:nvPicPr>
+                  <pic:blipFill>
+                    <a:blip r:embed="rId11"/>
+                    <a:stretch>
+                      <a:fillRect/>
+                    </a:stretch>
+                  </pic:blipFill>
+                  <pic:spPr>
+                    <a:xfrm>
+                      <a:off x="0" y="0"/>
+                      <a:ext cx="5760000" cy="749524"/>
+                    </a:xfrm>
+                    <a:prstGeom prst="rect"/>
+                  </pic:spPr>
+                </pic:pic>
+              </a:graphicData>
+            </a:graphic>
+          </wp:inline>
+        </w:drawing>
+      </w:r>
+    </w:p>
+    <w:p>
+      <w:pPr>
+        <w:spacing w:after="240"/>
+        <w:jc w:val="center"/>
+      </w:pPr>
+      <w:r>
+        <w:rPr>
+          <w:i/>
+          <w:sz w:val="22"/>
+        </w:rPr>
+        <w:t>Figure 1.2 – Output of type and which</w:t>
+      </w:r>
+    </w:p>
+    <w:p>
+      <w:pPr>
+        <w:keepNext/>
+        <w:spacing w:before="120"/>
+        <w:jc w:val="center"/>
+      </w:pPr>
+      <w:r>
+        <w:drawing>
+          <wp:inline xmlns:a="http://schemas.openxmlformats.org/drawingml/2006/main" xmlns:pic="http://schemas.openxmlformats.org/drawingml/2006/picture">
+            <wp:extent cx="5760000" cy="1506615"/>
+            <wp:docPr id="5" name="Picture 5"/>
+            <wp:cNvGraphicFramePr>
+              <a:graphicFrameLocks noChangeAspect="1"/>
+            </wp:cNvGraphicFramePr>
+            <a:graphic>
+              <a:graphicData uri="http://schemas.openxmlformats.org/drawingml/2006/picture">
+                <pic:pic>
+                  <pic:nvPicPr>
+                    <pic:cNvPr id="0" name="1.3.png"/>
+                    <pic:cNvPicPr/>
+                  </pic:nvPicPr>
+                  <pic:blipFill>
+                    <a:blip r:embed="rId12"/>
+                    <a:stretch>
+                      <a:fillRect/>
+                    </a:stretch>
+                  </pic:blipFill>
+                  <pic:spPr>
+                    <a:xfrm>
+                      <a:off x="0" y="0"/>
+                      <a:ext cx="5760000" cy="1506615"/>
+                    </a:xfrm>
+                    <a:prstGeom prst="rect"/>
+                  </pic:spPr>
+                </pic:pic>
+              </a:graphicData>
+            </a:graphic>
+          </wp:inline>
+        </w:drawing>
+      </w:r>
+    </w:p>
+    <w:p>
+      <w:pPr>
+        <w:spacing w:after="240"/>
+        <w:jc w:val="center"/>
+      </w:pPr>
+      <w:r>
+        <w:rPr>
+          <w:i/>
+          <w:sz w:val="22"/>
+        </w:rPr>
+        <w:t>Figure 1.3 – The directories in PATH</w:t>
+      </w:r>
+    </w:p>
+    <w:p>
+      <w:pPr>
+        <w:keepNext/>
+        <w:spacing w:before="120"/>
+        <w:jc w:val="center"/>
+      </w:pPr>
+      <w:r>
+        <w:drawing>
+          <wp:inline xmlns:a="http://schemas.openxmlformats.org/drawingml/2006/main" xmlns:pic="http://schemas.openxmlformats.org/drawingml/2006/picture">
+            <wp:extent cx="4320000" cy="360429"/>
+            <wp:docPr id="6" name="Picture 6"/>
+            <wp:cNvGraphicFramePr>
+              <a:graphicFrameLocks noChangeAspect="1"/>
+            </wp:cNvGraphicFramePr>
+            <a:graphic>
+              <a:graphicData uri="http://schemas.openxmlformats.org/drawingml/2006/picture">
+                <pic:pic>
+                  <pic:nvPicPr>
+                    <pic:cNvPr id="0" name="1.4.png"/>
+                    <pic:cNvPicPr/>
+                  </pic:nvPicPr>
+                  <pic:blipFill>
+                    <a:blip r:embed="rId13"/>
+                    <a:stretch>
+                      <a:fillRect/>
+                    </a:stretch>
+                  </pic:blipFill>
+                  <pic:spPr>
+                    <a:xfrm>
+                      <a:off x="0" y="0"/>
+                      <a:ext cx="4320000" cy="360429"/>
+                    </a:xfrm>
+                    <a:prstGeom prst="rect"/>
+                  </pic:spPr>
+                </pic:pic>
+              </a:graphicData>
+            </a:graphic>
+          </wp:inline>
+        </w:drawing>
+      </w:r>
+    </w:p>
+    <w:p>
+      <w:pPr>
+        <w:spacing w:after="240"/>
+        <w:jc w:val="center"/>
+      </w:pPr>
+      <w:r>
+        <w:rPr>
+          <w:i/>
+          <w:sz w:val="22"/>
+        </w:rPr>
+        <w:t>Figure 1.4 – Exit code of a missing command</w:t>
+      </w:r>
+    </w:p>
+    <w:p>
+      <w:pPr>
+        <w:spacing w:after="120"/>
+        <w:jc w:val="both"/>
+      </w:pPr>
+      <w:r>
+        <w:rPr>
+          <w:b/>
+          <w:sz w:val="24"/>
+        </w:rPr>
+        <w:t>Ctrl+R.</w:t>
+      </w:r>
+      <w:r>
+        <w:rPr>
+          <w:sz w:val="24"/>
+        </w:rPr>
+        <w:t xml:space="preserve"> After running </w:t>
+      </w:r>
+      <w:r>
+        <w:rPr>
+          <w:rFonts w:ascii="Courier New" w:hAnsi="Courier New"/>
+          <w:sz w:val="22"/>
+        </w:rPr>
+        <w:t>date</w:t>
+      </w:r>
+      <w:r>
+        <w:rPr>
+          <w:sz w:val="24"/>
+        </w:rPr>
+        <w:t xml:space="preserve">, </w:t>
+      </w:r>
+      <w:r>
+        <w:rPr>
+          <w:rFonts w:ascii="Courier New" w:hAnsi="Courier New"/>
+          <w:sz w:val="22"/>
+        </w:rPr>
+        <w:t>whoami</w:t>
+      </w:r>
+      <w:r>
+        <w:rPr>
+          <w:sz w:val="24"/>
+        </w:rPr>
+        <w:t xml:space="preserve"> and </w:t>
+      </w:r>
+      <w:r>
+        <w:rPr>
+          <w:rFonts w:ascii="Courier New" w:hAnsi="Courier New"/>
+          <w:sz w:val="22"/>
+        </w:rPr>
+        <w:t>pwd</w:t>
+      </w:r>
+      <w:r>
+        <w:rPr>
+          <w:sz w:val="24"/>
+        </w:rPr>
+        <w:t xml:space="preserve">, I pressed Ctrl+R and typed </w:t>
+      </w:r>
+      <w:r>
+        <w:rPr>
+          <w:rFonts w:ascii="Courier New" w:hAnsi="Courier New"/>
+          <w:sz w:val="22"/>
+        </w:rPr>
+        <w:t>dat</w:t>
+      </w:r>
+      <w:r>
+        <w:rPr>
+          <w:sz w:val="24"/>
+        </w:rPr>
+        <w:t xml:space="preserve">. The reverse history search found the earlier </w:t>
+      </w:r>
+      <w:r>
+        <w:rPr>
+          <w:rFonts w:ascii="Courier New" w:hAnsi="Courier New"/>
+          <w:sz w:val="22"/>
+        </w:rPr>
+        <w:t>date</w:t>
+      </w:r>
+      <w:r>
+        <w:rPr>
+          <w:sz w:val="24"/>
+        </w:rPr>
+        <w:t xml:space="preserve"> command, and Enter ran it again: the new time is 03:47:47, while the first run showed 03:47:14.</w:t>
+      </w:r>
+    </w:p>
+    <w:p>
+      <w:pPr>
+        <w:keepNext/>
+        <w:spacing w:before="120"/>
+        <w:jc w:val="center"/>
+      </w:pPr>
+      <w:r>
+        <w:drawing>
+          <wp:inline xmlns:a="http://schemas.openxmlformats.org/drawingml/2006/main" xmlns:pic="http://schemas.openxmlformats.org/drawingml/2006/picture">
             <wp:extent cx="5760000" cy="1477004"/>
-            <wp:docPr id="4" name="Picture 4"/>
+            <wp:docPr id="7" name="Picture 7"/>
             <wp:cNvGraphicFramePr>
               <a:graphicFrameLocks noChangeAspect="1"/>
             </wp:cNvGraphicFramePr>
@@ -1030,7 +1192,7 @@
                     <pic:cNvPicPr/>
                   </pic:nvPicPr>
                   <pic:blipFill>
-                    <a:blip r:embed="rId11"/>
+                    <a:blip r:embed="rId14"/>
                     <a:stretch>
                       <a:fillRect/>
                     </a:stretch>
@@ -1060,168 +1222,6 @@
           <w:sz w:val="22"/>
         </w:rPr>
         <w:t>Figure 1.5 – Re-running a command from history with Ctrl+R</w:t>
-      </w:r>
-    </w:p>
-    <w:p>
-      <w:pPr>
-        <w:keepNext/>
-        <w:spacing w:before="120"/>
-        <w:jc w:val="center"/>
-      </w:pPr>
-      <w:r>
-        <w:drawing>
-          <wp:inline xmlns:a="http://schemas.openxmlformats.org/drawingml/2006/main" xmlns:pic="http://schemas.openxmlformats.org/drawingml/2006/picture">
-            <wp:extent cx="5760000" cy="749524"/>
-            <wp:docPr id="5" name="Picture 5"/>
-            <wp:cNvGraphicFramePr>
-              <a:graphicFrameLocks noChangeAspect="1"/>
-            </wp:cNvGraphicFramePr>
-            <a:graphic>
-              <a:graphicData uri="http://schemas.openxmlformats.org/drawingml/2006/picture">
-                <pic:pic>
-                  <pic:nvPicPr>
-                    <pic:cNvPr id="0" name="1.2.png"/>
-                    <pic:cNvPicPr/>
-                  </pic:nvPicPr>
-                  <pic:blipFill>
-                    <a:blip r:embed="rId12"/>
-                    <a:stretch>
-                      <a:fillRect/>
-                    </a:stretch>
-                  </pic:blipFill>
-                  <pic:spPr>
-                    <a:xfrm>
-                      <a:off x="0" y="0"/>
-                      <a:ext cx="5760000" cy="749524"/>
-                    </a:xfrm>
-                    <a:prstGeom prst="rect"/>
-                  </pic:spPr>
-                </pic:pic>
-              </a:graphicData>
-            </a:graphic>
-          </wp:inline>
-        </w:drawing>
-      </w:r>
-    </w:p>
-    <w:p>
-      <w:pPr>
-        <w:spacing w:after="240"/>
-        <w:jc w:val="center"/>
-      </w:pPr>
-      <w:r>
-        <w:rPr>
-          <w:i/>
-          <w:sz w:val="22"/>
-        </w:rPr>
-        <w:t>Figure 1.2 – Output of type and which</w:t>
-      </w:r>
-    </w:p>
-    <w:p>
-      <w:pPr>
-        <w:keepNext/>
-        <w:spacing w:before="120"/>
-        <w:jc w:val="center"/>
-      </w:pPr>
-      <w:r>
-        <w:drawing>
-          <wp:inline xmlns:a="http://schemas.openxmlformats.org/drawingml/2006/main" xmlns:pic="http://schemas.openxmlformats.org/drawingml/2006/picture">
-            <wp:extent cx="5760000" cy="1506615"/>
-            <wp:docPr id="6" name="Picture 6"/>
-            <wp:cNvGraphicFramePr>
-              <a:graphicFrameLocks noChangeAspect="1"/>
-            </wp:cNvGraphicFramePr>
-            <a:graphic>
-              <a:graphicData uri="http://schemas.openxmlformats.org/drawingml/2006/picture">
-                <pic:pic>
-                  <pic:nvPicPr>
-                    <pic:cNvPr id="0" name="1.3.png"/>
-                    <pic:cNvPicPr/>
-                  </pic:nvPicPr>
-                  <pic:blipFill>
-                    <a:blip r:embed="rId13"/>
-                    <a:stretch>
-                      <a:fillRect/>
-                    </a:stretch>
-                  </pic:blipFill>
-                  <pic:spPr>
-                    <a:xfrm>
-                      <a:off x="0" y="0"/>
-                      <a:ext cx="5760000" cy="1506615"/>
-                    </a:xfrm>
-                    <a:prstGeom prst="rect"/>
-                  </pic:spPr>
-                </pic:pic>
-              </a:graphicData>
-            </a:graphic>
-          </wp:inline>
-        </w:drawing>
-      </w:r>
-    </w:p>
-    <w:p>
-      <w:pPr>
-        <w:spacing w:after="240"/>
-        <w:jc w:val="center"/>
-      </w:pPr>
-      <w:r>
-        <w:rPr>
-          <w:i/>
-          <w:sz w:val="22"/>
-        </w:rPr>
-        <w:t>Figure 1.3 – The directories in PATH</w:t>
-      </w:r>
-    </w:p>
-    <w:p>
-      <w:pPr>
-        <w:keepNext/>
-        <w:spacing w:before="120"/>
-        <w:jc w:val="center"/>
-      </w:pPr>
-      <w:r>
-        <w:drawing>
-          <wp:inline xmlns:a="http://schemas.openxmlformats.org/drawingml/2006/main" xmlns:pic="http://schemas.openxmlformats.org/drawingml/2006/picture">
-            <wp:extent cx="4320000" cy="360429"/>
-            <wp:docPr id="7" name="Picture 7"/>
-            <wp:cNvGraphicFramePr>
-              <a:graphicFrameLocks noChangeAspect="1"/>
-            </wp:cNvGraphicFramePr>
-            <a:graphic>
-              <a:graphicData uri="http://schemas.openxmlformats.org/drawingml/2006/picture">
-                <pic:pic>
-                  <pic:nvPicPr>
-                    <pic:cNvPr id="0" name="1.4.png"/>
-                    <pic:cNvPicPr/>
-                  </pic:nvPicPr>
-                  <pic:blipFill>
-                    <a:blip r:embed="rId14"/>
-                    <a:stretch>
-                      <a:fillRect/>
-                    </a:stretch>
-                  </pic:blipFill>
-                  <pic:spPr>
-                    <a:xfrm>
-                      <a:off x="0" y="0"/>
-                      <a:ext cx="4320000" cy="360429"/>
-                    </a:xfrm>
-                    <a:prstGeom prst="rect"/>
-                  </pic:spPr>
-                </pic:pic>
-              </a:graphicData>
-            </a:graphic>
-          </wp:inline>
-        </w:drawing>
-      </w:r>
-    </w:p>
-    <w:p>
-      <w:pPr>
-        <w:spacing w:after="240"/>
-        <w:jc w:val="center"/>
-      </w:pPr>
-      <w:r>
-        <w:rPr>
-          <w:i/>
-          <w:sz w:val="22"/>
-        </w:rPr>
-        <w:t>Figure 1.4 – Exit code of a missing command</w:t>
       </w:r>
     </w:p>
     <w:p>

</xml_diff>